<commit_message>
docs: replace all § symbols with 'Section' for plain English readability
Replaced all section sign (§) symbols with the word 'Section' across all
markdown documentation files for improved accessibility and plain English
readability. Regenerated all corresponding .docx and .pdf files.

Affected documents (15 total, 45 files):
- ACRME_Scoring_Weights_Explained
- acrme_architecture_decision_records
- acrme_calculation_logic_reference
- acrme_complete_requirements_reference
- acrme_design_change_and_fdd_tdd_plan
- acrme_executive_design_document
- acrme_functional_design_document
- acrme_hard_constraints_reference
- acrme_plain_english_walkthrough
- acrme_production_readiness_review_and_architecture
- acrme_requirements_baseline_v2_2
- acrme_requirements_deviation_analysis
- acrme_security_and_rbac_guide
- acrme_technical_design_document
- acrme_uml_class_diagrams_summary

Total replacements: 175+ occurrences across all documents.
</commit_message>
<xml_diff>
--- a/docs/ACRME_Scoring_Weights_Explained.docx
+++ b/docs/ACRME_Scoring_Weights_Explained.docx
@@ -1132,7 +1132,7 @@
         <w:t xml:space="preserve"> </w:t>
       </w:r>
       <w:r>
-        <w:t xml:space="preserve">The PRR (§28) updates Distribution to use</w:t>
+        <w:t xml:space="preserve">The PRR (Section 28) updates Distribution to use</w:t>
       </w:r>
       <w:r>
         <w:t xml:space="preserve"> </w:t>
@@ -1588,7 +1588,7 @@
         <w:t xml:space="preserve"> </w:t>
       </w:r>
       <w:r>
-        <w:t xml:space="preserve">δ duplicates α intentionally — this was flagged in the PRR (§28) as double-counting. The corrected pilot formula proposes revised NonProd weights:</w:t>
+        <w:t xml:space="preserve">δ duplicates α intentionally — this was flagged in the PRR (Section 28) as double-counting. The corrected pilot formula proposes revised NonProd weights:</w:t>
       </w:r>
       <w:r>
         <w:t xml:space="preserve"> </w:t>
@@ -3382,7 +3382,7 @@
         <w:t xml:space="preserve">docs/acrme_production_readiness_review_and_architecture.md</w:t>
       </w:r>
       <w:r>
-        <w:t xml:space="preserve">) — §28 lines 1095–1160, corrected scoring model</w:t>
+        <w:t xml:space="preserve">) — Section 28 lines 1095–1160, corrected scoring model</w:t>
       </w:r>
     </w:p>
     <w:p>
@@ -3451,7 +3451,7 @@
         <w:t xml:space="preserve"> </w:t>
       </w:r>
       <w:r>
-        <w:t xml:space="preserve">— Defined in Multi-Region Placement Design and PRR §28</w:t>
+        <w:t xml:space="preserve">— Defined in Multi-Region Placement Design and PRR Section 28</w:t>
       </w:r>
     </w:p>
     <w:p>

</xml_diff>